<commit_message>
HC REV12: back cover, KDP counts, notes
</commit_message>
<xml_diff>
--- a/NOVELS/The Department of Historical Corrections/The Department of Historical Corrections - REV12.docx
+++ b/NOVELS/The Department of Historical Corrections/The Department of Historical Corrections - REV12.docx
@@ -23339,6 +23339,47 @@
       <w:r>
         <w:rPr/>
         <w:t>Auswandern – Ab in die USA, Kanada, Australien oder Neuseeland?</w:t>
+      </w:r>
+    </w:p>
+    <w:p>
+      <w:pPr>
+        <w:pStyle w:val="Centered"/>
+        <w:pageBreakBefore/>
+        <w:spacing w:before="0" w:after="0"/>
+      </w:pPr>
+      <w:r>
+        <w:drawing>
+          <wp:inline xmlns:a="http://schemas.openxmlformats.org/drawingml/2006/main" xmlns:pic="http://schemas.openxmlformats.org/drawingml/2006/picture">
+            <wp:extent cx="2371725" cy="3794760"/>
+            <wp:docPr id="7" name="Picture 7" descr="Back cover: the title, the tagline &quot;Belgium has stopped existing. It is Monday.&quot;, a short blurb, three selling lines, a one-sentence author note and the Also-by series list." title="Back cover"/>
+            <wp:cNvGraphicFramePr>
+              <a:graphicFrameLocks noChangeAspect="1"/>
+            </wp:cNvGraphicFramePr>
+            <a:graphic>
+              <a:graphicData uri="http://schemas.openxmlformats.org/drawingml/2006/picture">
+                <pic:pic>
+                  <pic:nvPicPr>
+                    <pic:cNvPr id="0" name="The Department of Historical Corrections - back cover 1000x1600.png"/>
+                    <pic:cNvPicPr/>
+                  </pic:nvPicPr>
+                  <pic:blipFill>
+                    <a:blip r:embed="rId15"/>
+                    <a:stretch>
+                      <a:fillRect/>
+                    </a:stretch>
+                  </pic:blipFill>
+                  <pic:spPr>
+                    <a:xfrm>
+                      <a:off x="0" y="0"/>
+                      <a:ext cx="2371725" cy="3794760"/>
+                    </a:xfrm>
+                    <a:prstGeom prst="rect"/>
+                  </pic:spPr>
+                </pic:pic>
+              </a:graphicData>
+            </a:graphic>
+          </wp:inline>
+        </w:drawing>
       </w:r>
     </w:p>
     <w:sectPr>

</xml_diff>